<commit_message>
fix(ui,exporters): word kaydet buton metni kisaltildi ve dosya kaydinda bolge etiketleri temizlendi
</commit_message>
<xml_diff>
--- a/REAL_TEST/exports/sample10_easyocr.docx
+++ b/REAL_TEST/exports/sample10_easyocr.docx
@@ -2,11 +2,6 @@
 <file path=word/document.xml><?xml version="1.0" encoding="utf-8"?>
 <w:document xmlns:wpc="http://schemas.microsoft.com/office/word/2010/wordprocessingCanvas" xmlns:mo="http://schemas.microsoft.com/office/mac/office/2008/main" xmlns:mc="http://schemas.openxmlformats.org/markup-compatibility/2006" xmlns:mv="urn:schemas-microsoft-com:mac:vml" xmlns:o="urn:schemas-microsoft-com:office:office" xmlns:r="http://schemas.openxmlformats.org/officeDocument/2006/relationships" xmlns:m="http://schemas.openxmlformats.org/officeDocument/2006/math" xmlns:v="urn:schemas-microsoft-com:vml" xmlns:wp14="http://schemas.microsoft.com/office/word/2010/wordprocessingDrawing" xmlns:wp="http://schemas.openxmlformats.org/drawingml/2006/wordprocessingDrawing" xmlns:w10="urn:schemas-microsoft-com:office:word" xmlns:w="http://schemas.openxmlformats.org/wordprocessingml/2006/main" xmlns:w14="http://schemas.microsoft.com/office/word/2010/wordml" xmlns:wpg="http://schemas.microsoft.com/office/word/2010/wordprocessingGroup" xmlns:wpi="http://schemas.microsoft.com/office/word/2010/wordprocessingInk" xmlns:wne="http://schemas.microsoft.com/office/word/2006/wordml" xmlns:wps="http://schemas.microsoft.com/office/word/2010/wordprocessingShape" mc:Ignorable="w14 wp14">
   <w:body>
-    <w:p>
-      <w:r>
-        <w:t>[1. Bölge]</w:t>
-      </w:r>
-    </w:p>
     <w:p>
       <w:r>
         <w:t>Finansal</w:t>
@@ -25,11 +20,6 @@
     <w:p/>
     <w:p>
       <w:r>
-        <w:t>[2. Bölge]</w:t>
-      </w:r>
-    </w:p>
-    <w:p>
-      <w:r>
         <w:t>Haberler &amp;</w:t>
       </w:r>
     </w:p>
@@ -39,11 +29,6 @@
       </w:r>
     </w:p>
     <w:p/>
-    <w:p>
-      <w:r>
-        <w:t>[3. Bölge]</w:t>
-      </w:r>
-    </w:p>
     <w:p>
       <w:r>
         <w:t>MAKİNE</w:t>
@@ -57,11 +42,6 @@
     <w:p/>
     <w:p>
       <w:r>
-        <w:t>[4. Bölge]</w:t>
-      </w:r>
-    </w:p>
-    <w:p>
-      <w:r>
         <w:t>Fiyat</w:t>
       </w:r>
     </w:p>
@@ -71,11 +51,6 @@
       </w:r>
     </w:p>
     <w:p/>
-    <w:p>
-      <w:r>
-        <w:t>[5. Bölge]</w:t>
-      </w:r>
-    </w:p>
     <w:p>
       <w:r>
         <w:t>Duygu</w:t>
@@ -89,11 +64,6 @@
     <w:p/>
     <w:p>
       <w:r>
-        <w:t>[6. Bölge]</w:t>
-      </w:r>
-    </w:p>
-    <w:p>
-      <w:r>
         <w:t>Ris &lt;</w:t>
       </w:r>
     </w:p>
@@ -105,11 +75,6 @@
     <w:p/>
     <w:p>
       <w:r>
-        <w:t>[7. Bölge]</w:t>
-      </w:r>
-    </w:p>
-    <w:p>
-      <w:r>
         <w:t>Portföy</w:t>
       </w:r>
     </w:p>
@@ -119,11 +84,6 @@
       </w:r>
     </w:p>
     <w:p/>
-    <w:p>
-      <w:r>
-        <w:t>[8. Bölge]</w:t>
-      </w:r>
-    </w:p>
     <w:p>
       <w:r>
         <w:t>YATIRIM</w:t>

</xml_diff>